<commit_message>
Add portfolio link to all resume variants
Co-Authored-By: Claude Sonnet 5 <noreply@anthropic.com>
</commit_message>
<xml_diff>
--- a/public/resume/Sean_Despain_Master_Resume.docx
+++ b/public/resume/Sean_Despain_Master_Resume.docx
@@ -21,7 +21,7 @@
     </w:p>
     <w:p>
       <w:pPr>
-        <w:spacing w:after="200"/>
+        <w:spacing w:after="40"/>
         <w:jc w:val="center"/>
       </w:pPr>
       <w:r>
@@ -36,15 +36,17 @@
     </w:p>
     <w:p>
       <w:pPr>
-        <w:spacing w:after="100"/>
-      </w:pPr>
-      <w:r>
-        <w:rPr>
-          <w:rFonts w:ascii="Calibri" w:cs="Calibri" w:eastAsia="Calibri" w:hAnsi="Calibri"/>
-          <w:sz w:val="20"/>
-          <w:szCs w:val="20"/>
-        </w:rPr>
-        <w:t xml:space="preserve">LinkedIn: linkedin.com/in/sean-despain-560316116 · Portfolio: [to add once published]</w:t>
+        <w:spacing w:after="40"/>
+        <w:jc w:val="center"/>
+      </w:pPr>
+      <w:r>
+        <w:rPr>
+          <w:rFonts w:ascii="Calibri" w:cs="Calibri" w:eastAsia="Calibri" w:hAnsi="Calibri"/>
+          <w:color w:val="555555"/>
+          <w:sz w:val="19"/>
+          <w:szCs w:val="19"/>
+        </w:rPr>
+        <w:t xml:space="preserve">LinkedIn: linkedin.com/in/sean-despain-560316116 · Portfolio: seandespain.com</w:t>
       </w:r>
     </w:p>
     <w:p>

</xml_diff>

<commit_message>
Serve the resume as a PDF across the site
Every resume link now points at a typeset PDF (opens in a new tab from the
header, downloads from the buttons). The contact page keeps a Word copy
for application portals that ask for one. PDFs for all seven resumes are
published alongside the .docx files, generated from the same source so
the two formats always match. Also drops an internal working note that
was printing at the bottom of the master resume.

Co-Authored-By: Claude Opus 5.5 <noreply@anthropic.com>
</commit_message>
<xml_diff>
--- a/public/resume/Sean_Despain_Master_Resume.docx
+++ b/public/resume/Sean_Despain_Master_Resume.docx
@@ -990,22 +990,6 @@
           <w:szCs w:val="20"/>
         </w:rPr>
         <w:t xml:space="preserve">Content Marketing Certification (including AI-assisted marketing tools)</w:t>
-      </w:r>
-    </w:p>
-    <w:p>
-      <w:pPr>
-        <w:spacing w:after="40" w:before="160"/>
-      </w:pPr>
-      <w:r>
-        <w:rPr>
-          <w:rFonts w:ascii="Calibri" w:cs="Calibri" w:eastAsia="Calibri" w:hAnsi="Calibri"/>
-          <w:i/>
-          <w:iCs/>
-          <w:color w:val="555555"/>
-          <w:sz w:val="18"/>
-          <w:szCs w:val="18"/>
-        </w:rPr>
-        <w:t xml:space="preserve">This is the master/internal version. Application-ready variants (1–2 pages each, role-specific) are derived from this file. See the six variant files in this folder.</w:t>
       </w:r>
     </w:p>
     <w:sectPr>

</xml_diff>

<commit_message>
Add Leads to Sales role to the resumes; Peace Life now based in Heber
Hiring Manager & Sales Trainer at Leads to Sales (2026) on the master
resume and the hybrid, product/UX, marketing, and creative director
versions, in both PDF and Word.

Co-Authored-By: Claude Opus 5.5 <noreply@anthropic.com>
</commit_message>
<xml_diff>
--- a/public/resume/Sean_Despain_Master_Resume.docx
+++ b/public/resume/Sean_Despain_Master_Resume.docx
@@ -76,7 +76,7 @@
           <w:sz w:val="20"/>
           <w:szCs w:val="20"/>
         </w:rPr>
-        <w:t xml:space="preserve">Product builder who takes ideas from concept through design, development, brand, and launch, usually alone or with a small team. Founded and operated five ventures spanning a wellness app live on the App Store, an internal business-operations platform, a 50-person construction staffing company, an international CBD company, and a bilingual retreat/conservation program in the Peruvian Amazon. Comfortable owning the full surface of a product: UX and visual design, front-end and back-end implementation, brand and content systems, SEO and conversion, and the operating decisions that keep a real business running.</w:t>
+        <w:t xml:space="preserve">Product builder who takes ideas from concept through design, development, brand, and launch, usually alone or with a small team. Founded and operated five ventures spanning a wellness app live on the App Store, an internal business-operations platform, a 50-person construction staffing company, an international CBD company, and a bilingual retreat/conservation program in the Peruvian Amazon. Comfortable owning the full surface of a product: UX and visual design, front-end and back-end code, brand and content systems, SEO and conversion, and the operating decisions that keep a business running.</w:t>
       </w:r>
     </w:p>
     <w:p>
@@ -210,7 +210,7 @@
           <w:sz w:val="21"/>
           <w:szCs w:val="21"/>
         </w:rPr>
-        <w:t xml:space="preserve"> · Team building &amp; leadership (50+ contractors/employees) · Payroll &amp; workforce operations · Financial strategy &amp; investor relations · Nonprofit program direction · Vendor/scope judgment</w:t>
+        <w:t xml:space="preserve"> · Team building &amp; leadership (50+ contractors/employees) · Payroll &amp; workforce operations · Financial strategy &amp; investor relations · Hiring &amp; sales training · Nonprofit program direction · Vendor/scope judgment</w:t>
       </w:r>
     </w:p>
     <w:p>
@@ -261,7 +261,7 @@
           <w:sz w:val="18"/>
           <w:szCs w:val="18"/>
         </w:rPr>
-        <w:t xml:space="preserve">Provo, UT · Jan 2021 – Present</w:t>
+        <w:t xml:space="preserve">Heber, UT · Jan 2021 – Present</w:t>
       </w:r>
     </w:p>
     <w:p>
@@ -456,6 +456,74 @@
           <w:szCs w:val="20"/>
         </w:rPr>
         <w:t xml:space="preserve">Provide strategic guidance on scaling the nonprofit's international efforts.</w:t>
+      </w:r>
+    </w:p>
+    <w:p>
+      <w:pPr>
+        <w:spacing w:after="60" w:before="160"/>
+      </w:pPr>
+      <w:r>
+        <w:rPr>
+          <w:rFonts w:ascii="Calibri" w:cs="Calibri" w:eastAsia="Calibri" w:hAnsi="Calibri"/>
+          <w:b/>
+          <w:bCs/>
+          <w:color w:val="1F3A5F"/>
+          <w:sz w:val="21"/>
+          <w:szCs w:val="21"/>
+        </w:rPr>
+        <w:t xml:space="preserve">Hiring Manager &amp; Sales Trainer · Leads to Sales</w:t>
+      </w:r>
+    </w:p>
+    <w:p>
+      <w:pPr>
+        <w:spacing w:after="40" w:before="160"/>
+      </w:pPr>
+      <w:r>
+        <w:rPr>
+          <w:rFonts w:ascii="Calibri" w:cs="Calibri" w:eastAsia="Calibri" w:hAnsi="Calibri"/>
+          <w:i/>
+          <w:iCs/>
+          <w:color w:val="555555"/>
+          <w:sz w:val="18"/>
+          <w:szCs w:val="18"/>
+        </w:rPr>
+        <w:t xml:space="preserve">2026</w:t>
+      </w:r>
+    </w:p>
+    <w:p>
+      <w:pPr>
+        <w:pStyle w:val="ListParagraph"/>
+        <w:numPr>
+          <w:ilvl w:val="0"/>
+          <w:numId w:val="2"/>
+        </w:numPr>
+        <w:spacing w:after="60"/>
+      </w:pPr>
+      <w:r>
+        <w:rPr>
+          <w:rFonts w:ascii="Calibri" w:cs="Calibri" w:eastAsia="Calibri" w:hAnsi="Calibri"/>
+          <w:sz w:val="20"/>
+          <w:szCs w:val="20"/>
+        </w:rPr>
+        <w:t xml:space="preserve">Ran hiring for the sales team at a seven-figure marketing company, from screening and interviews through the final hiring decision.</w:t>
+      </w:r>
+    </w:p>
+    <w:p>
+      <w:pPr>
+        <w:pStyle w:val="ListParagraph"/>
+        <w:numPr>
+          <w:ilvl w:val="0"/>
+          <w:numId w:val="2"/>
+        </w:numPr>
+        <w:spacing w:after="60"/>
+      </w:pPr>
+      <w:r>
+        <w:rPr>
+          <w:rFonts w:ascii="Calibri" w:cs="Calibri" w:eastAsia="Calibri" w:hAnsi="Calibri"/>
+          <w:sz w:val="20"/>
+          <w:szCs w:val="20"/>
+        </w:rPr>
+        <w:t xml:space="preserve">Trained and coached new hires and existing reps on the company's sales process, getting every new team member ready to sell.</w:t>
       </w:r>
     </w:p>
     <w:p>

</xml_diff>

<commit_message>
Add the Leads to Sales AI Trainer to the resumes
AI sales-roleplay trainer built for Leads to Sales while serving as its
hiring manager and sales trainer, and usable by any company's sales
team: 11 scenarios against an AI prospect with AI scoring and coaching,
a weekly leaderboard, and session history. Added to the master, hybrid,
software, and product/UX versions; the software version now lists the
Leads to Sales role too.

Co-Authored-By: Claude Opus 5.5 <noreply@anthropic.com>
</commit_message>
<xml_diff>
--- a/public/resume/Sean_Despain_Master_Resume.docx
+++ b/public/resume/Sean_Despain_Master_Resume.docx
@@ -505,25 +505,43 @@
           <w:sz w:val="20"/>
           <w:szCs w:val="20"/>
         </w:rPr>
-        <w:t xml:space="preserve">Ran hiring for the sales team at a seven-figure marketing company, from screening and interviews through the final hiring decision.</w:t>
-      </w:r>
-    </w:p>
-    <w:p>
-      <w:pPr>
-        <w:pStyle w:val="ListParagraph"/>
-        <w:numPr>
-          <w:ilvl w:val="0"/>
-          <w:numId w:val="2"/>
-        </w:numPr>
-        <w:spacing w:after="60"/>
-      </w:pPr>
-      <w:r>
-        <w:rPr>
-          <w:rFonts w:ascii="Calibri" w:cs="Calibri" w:eastAsia="Calibri" w:hAnsi="Calibri"/>
-          <w:sz w:val="20"/>
-          <w:szCs w:val="20"/>
-        </w:rPr>
-        <w:t xml:space="preserve">Trained and coached new hires and existing reps on the company's sales process, getting every new team member ready to sell.</w:t>
+        <w:t xml:space="preserve">Ran hiring for the sales team at a seven-figure marketing company, from screening and interviews to final decisions.</w:t>
+      </w:r>
+    </w:p>
+    <w:p>
+      <w:pPr>
+        <w:pStyle w:val="ListParagraph"/>
+        <w:numPr>
+          <w:ilvl w:val="0"/>
+          <w:numId w:val="2"/>
+        </w:numPr>
+        <w:spacing w:after="60"/>
+      </w:pPr>
+      <w:r>
+        <w:rPr>
+          <w:rFonts w:ascii="Calibri" w:cs="Calibri" w:eastAsia="Calibri" w:hAnsi="Calibri"/>
+          <w:sz w:val="20"/>
+          <w:szCs w:val="20"/>
+        </w:rPr>
+        <w:t xml:space="preserve">Trained and coached new and existing reps on the company's sales process, getting every new hire ready to sell.</w:t>
+      </w:r>
+    </w:p>
+    <w:p>
+      <w:pPr>
+        <w:pStyle w:val="ListParagraph"/>
+        <w:numPr>
+          <w:ilvl w:val="0"/>
+          <w:numId w:val="2"/>
+        </w:numPr>
+        <w:spacing w:after="60"/>
+      </w:pPr>
+      <w:r>
+        <w:rPr>
+          <w:rFonts w:ascii="Calibri" w:cs="Calibri" w:eastAsia="Calibri" w:hAnsi="Calibri"/>
+          <w:sz w:val="20"/>
+          <w:szCs w:val="20"/>
+        </w:rPr>
+        <w:t xml:space="preserve">Designed and built the team's AI sales trainer (see Selected Projects): reps roleplay 11 real-world sales scenarios against an AI prospect and get scored and coached after every session.</w:t>
       </w:r>
     </w:p>
     <w:p>
@@ -807,7 +825,7 @@
           <w:sz w:val="20"/>
           <w:szCs w:val="20"/>
         </w:rPr>
-        <w:t xml:space="preserve">Unity/iOS wellness app plus its marketing site. See Experience above for the full build. Live: apps.apple.com (Peace Life) · peacelifehealing.com</w:t>
+        <w:t xml:space="preserve">Unity/iOS wellness app plus its marketing site (full build under Experience). Live on the App Store and at peacelifehealing.com.</w:t>
       </w:r>
     </w:p>
     <w:p>
@@ -939,7 +957,7 @@
           <w:sz w:val="21"/>
           <w:szCs w:val="21"/>
         </w:rPr>
-        <w:t xml:space="preserve">Leads to Sales AI Trainer *(early-stage prototype)*</w:t>
+        <w:t xml:space="preserve">Leads to Sales AI Trainer · AI Sales-Training App</w:t>
       </w:r>
     </w:p>
     <w:p>
@@ -952,7 +970,7 @@
           <w:sz w:val="20"/>
           <w:szCs w:val="20"/>
         </w:rPr>
-        <w:t xml:space="preserve">Unity front end paired with a Node/Express + OpenAI backend for scenario-based sales roleplay with scored feedback. Early MVP-scaffold stage.</w:t>
+        <w:t xml:space="preserve">Built for Leads to Sales while serving as the company's hiring manager and sales trainer, and works for any company's sales team. Unity (C#) app with a Node/Express backend on the OpenAI API: an AI prospect plays out 11 realistic scenarios (cold calls, price and budget objections, gatekeepers, booking the appointment), then an AI coach scores the rep on confidence, discovery, objection handling, and closing, with what went well, what to improve, and a line to try next time. A weekly leaderboard and session history keep reps practicing.</w:t>
       </w:r>
     </w:p>
     <w:p>
@@ -971,7 +989,7 @@
           <w:sz w:val="22"/>
           <w:szCs w:val="22"/>
         </w:rPr>
-        <w:t xml:space="preserve">EDUCATION</w:t>
+        <w:t xml:space="preserve">EDUCATION &amp; CERTIFICATIONS</w:t>
       </w:r>
     </w:p>
     <w:p>
@@ -984,80 +1002,7 @@
           <w:sz w:val="20"/>
           <w:szCs w:val="20"/>
         </w:rPr>
-        <w:t xml:space="preserve">Utah Valley University · Coursework in Robotics &amp; Technology (2017–2019)</w:t>
-      </w:r>
-    </w:p>
-    <w:p>
-      <w:pPr>
-        <w:pBdr>
-          <w:bottom w:val="single" w:color="1F3A5F" w:sz="6" w:space="2"/>
-        </w:pBdr>
-        <w:spacing w:after="100" w:before="260"/>
-      </w:pPr>
-      <w:r>
-        <w:rPr>
-          <w:rFonts w:ascii="Calibri" w:cs="Calibri" w:eastAsia="Calibri" w:hAnsi="Calibri"/>
-          <w:b/>
-          <w:bCs/>
-          <w:color w:val="1F3A5F"/>
-          <w:sz w:val="22"/>
-          <w:szCs w:val="22"/>
-        </w:rPr>
-        <w:t xml:space="preserve">CERTIFICATIONS</w:t>
-      </w:r>
-    </w:p>
-    <w:p>
-      <w:pPr>
-        <w:pStyle w:val="ListParagraph"/>
-        <w:numPr>
-          <w:ilvl w:val="0"/>
-          <w:numId w:val="2"/>
-        </w:numPr>
-        <w:spacing w:after="60"/>
-      </w:pPr>
-      <w:r>
-        <w:rPr>
-          <w:rFonts w:ascii="Calibri" w:cs="Calibri" w:eastAsia="Calibri" w:hAnsi="Calibri"/>
-          <w:sz w:val="20"/>
-          <w:szCs w:val="20"/>
-        </w:rPr>
-        <w:t xml:space="preserve">Graphic Design Certification</w:t>
-      </w:r>
-    </w:p>
-    <w:p>
-      <w:pPr>
-        <w:pStyle w:val="ListParagraph"/>
-        <w:numPr>
-          <w:ilvl w:val="0"/>
-          <w:numId w:val="2"/>
-        </w:numPr>
-        <w:spacing w:after="60"/>
-      </w:pPr>
-      <w:r>
-        <w:rPr>
-          <w:rFonts w:ascii="Calibri" w:cs="Calibri" w:eastAsia="Calibri" w:hAnsi="Calibri"/>
-          <w:sz w:val="20"/>
-          <w:szCs w:val="20"/>
-        </w:rPr>
-        <w:t xml:space="preserve">Business Growth &amp; Strategy Certification</w:t>
-      </w:r>
-    </w:p>
-    <w:p>
-      <w:pPr>
-        <w:pStyle w:val="ListParagraph"/>
-        <w:numPr>
-          <w:ilvl w:val="0"/>
-          <w:numId w:val="2"/>
-        </w:numPr>
-        <w:spacing w:after="60"/>
-      </w:pPr>
-      <w:r>
-        <w:rPr>
-          <w:rFonts w:ascii="Calibri" w:cs="Calibri" w:eastAsia="Calibri" w:hAnsi="Calibri"/>
-          <w:sz w:val="20"/>
-          <w:szCs w:val="20"/>
-        </w:rPr>
-        <w:t xml:space="preserve">Content Marketing Certification (including AI-assisted marketing tools)</w:t>
+        <w:t xml:space="preserve">Utah Valley University · Coursework in Robotics &amp; Technology (2017–2019) · Graphic Design Certification · Business Growth &amp; Strategy Certification · Content Marketing Certification (including AI-assisted marketing tools)</w:t>
       </w:r>
     </w:p>
     <w:sectPr>

</xml_diff>